<commit_message>
Minor changes to response
</commit_message>
<xml_diff>
--- a/Manuscripts/Mammary Gland aTSC/Response to Reviewers.docx
+++ b/Manuscripts/Mammary Gland aTSC/Response to Reviewers.docx
@@ -447,7 +447,15 @@
         <w:rPr>
           <w:shd w:val="clear" w:color="auto" w:fill="FFFFFF"/>
         </w:rPr>
-        <w:t xml:space="preserve">3- Recent studies from Phil Scherer group have shown that mammary gland adipocytes de-differentiate upon lactation losing lipid droplets. </w:t>
+        <w:t xml:space="preserve">3- </w:t>
+      </w:r>
+      <w:commentRangeStart w:id="3"/>
+      <w:commentRangeStart w:id="4"/>
+      <w:r>
+        <w:rPr>
+          <w:shd w:val="clear" w:color="auto" w:fill="FFFFFF"/>
+        </w:rPr>
+        <w:t xml:space="preserve">Recent studies from Phil Scherer group have shown that mammary gland adipocytes de-differentiate upon lactation losing lipid droplets. </w:t>
       </w:r>
       <w:proofErr w:type="gramStart"/>
       <w:r>
@@ -466,6 +474,20 @@
       <w:r>
         <w:br/>
       </w:r>
+      <w:commentRangeEnd w:id="3"/>
+      <w:r>
+        <w:rPr>
+          <w:rStyle w:val="CommentReference"/>
+        </w:rPr>
+        <w:commentReference w:id="3"/>
+      </w:r>
+      <w:commentRangeEnd w:id="4"/>
+      <w:r>
+        <w:rPr>
+          <w:rStyle w:val="CommentReference"/>
+        </w:rPr>
+        <w:commentReference w:id="4"/>
+      </w:r>
       <w:r>
         <w:br/>
       </w:r>
@@ -495,8 +517,6 @@
         </w:rPr>
         <w:t>,</w:t>
       </w:r>
-      <w:bookmarkStart w:id="3" w:name="_GoBack"/>
-      <w:bookmarkEnd w:id="3"/>
       <w:r>
         <w:rPr>
           <w:b/>
@@ -533,7 +553,7 @@
         </w:rPr>
         <w:t xml:space="preserve">this in the methods section to read </w:t>
       </w:r>
-      <w:commentRangeStart w:id="4"/>
+      <w:commentRangeStart w:id="5"/>
       <w:r>
         <w:rPr>
           <w:b/>
@@ -547,12 +567,12 @@
         </w:rPr>
         <w:t xml:space="preserve"> </w:t>
       </w:r>
-      <w:commentRangeEnd w:id="4"/>
-      <w:r>
-        <w:rPr>
-          <w:rStyle w:val="CommentReference"/>
-        </w:rPr>
-        <w:commentReference w:id="4"/>
+      <w:commentRangeEnd w:id="5"/>
+      <w:r>
+        <w:rPr>
+          <w:rStyle w:val="CommentReference"/>
+        </w:rPr>
+        <w:commentReference w:id="5"/>
       </w:r>
       <w:r>
         <w:rPr>
@@ -588,19 +608,19 @@
           <w:shd w:val="clear" w:color="auto" w:fill="FFFFFF"/>
         </w:rPr>
       </w:pPr>
-      <w:commentRangeStart w:id="5"/>
+      <w:commentRangeStart w:id="6"/>
       <w:r>
         <w:rPr>
           <w:b/>
         </w:rPr>
         <w:t>Fixed</w:t>
       </w:r>
-      <w:commentRangeEnd w:id="5"/>
-      <w:r>
-        <w:rPr>
-          <w:rStyle w:val="CommentReference"/>
-        </w:rPr>
-        <w:commentReference w:id="5"/>
+      <w:commentRangeEnd w:id="6"/>
+      <w:r>
+        <w:rPr>
+          <w:rStyle w:val="CommentReference"/>
+        </w:rPr>
+        <w:commentReference w:id="6"/>
       </w:r>
       <w:r>
         <w:br/>
@@ -636,7 +656,7 @@
         </w:rPr>
         <w:t xml:space="preserve">We agree have added this as a table (Table </w:t>
       </w:r>
-      <w:commentRangeStart w:id="6"/>
+      <w:commentRangeStart w:id="7"/>
       <w:r>
         <w:rPr>
           <w:b/>
@@ -644,13 +664,13 @@
         </w:rPr>
         <w:t>2</w:t>
       </w:r>
-      <w:commentRangeEnd w:id="6"/>
-      <w:r>
-        <w:rPr>
-          <w:rStyle w:val="CommentReference"/>
-          <w:b/>
-        </w:rPr>
-        <w:commentReference w:id="6"/>
+      <w:commentRangeEnd w:id="7"/>
+      <w:r>
+        <w:rPr>
+          <w:rStyle w:val="CommentReference"/>
+          <w:b/>
+        </w:rPr>
+        <w:commentReference w:id="7"/>
       </w:r>
       <w:r>
         <w:rPr>
@@ -698,7 +718,8 @@
           <w:b/>
         </w:rPr>
       </w:pPr>
-      <w:commentRangeStart w:id="7"/>
+      <w:commentRangeStart w:id="8"/>
+      <w:commentRangeStart w:id="9"/>
       <w:r>
         <w:rPr>
           <w:b/>
@@ -824,12 +845,19 @@
         </w:rPr>
         <w:t xml:space="preserve"> metabolism and provide those below:</w:t>
       </w:r>
-      <w:commentRangeEnd w:id="7"/>
-      <w:r>
-        <w:rPr>
-          <w:rStyle w:val="CommentReference"/>
-        </w:rPr>
-        <w:commentReference w:id="7"/>
+      <w:commentRangeEnd w:id="8"/>
+      <w:r>
+        <w:rPr>
+          <w:rStyle w:val="CommentReference"/>
+        </w:rPr>
+        <w:commentReference w:id="8"/>
+      </w:r>
+      <w:commentRangeEnd w:id="9"/>
+      <w:r>
+        <w:rPr>
+          <w:rStyle w:val="CommentReference"/>
+        </w:rPr>
+        <w:commentReference w:id="9"/>
       </w:r>
     </w:p>
     <w:p/>
@@ -862,20 +890,20 @@
         </w:rPr>
         <w:t xml:space="preserve">This is an excellent point, and indeed adiponectin expression in the mammary gland is </w:t>
       </w:r>
-      <w:commentRangeStart w:id="8"/>
+      <w:commentRangeStart w:id="11"/>
       <w:r>
         <w:rPr>
           <w:b/>
         </w:rPr>
         <w:t>XXX</w:t>
       </w:r>
-      <w:commentRangeEnd w:id="8"/>
-      <w:r>
-        <w:rPr>
-          <w:rStyle w:val="CommentReference"/>
-          <w:b/>
-        </w:rPr>
-        <w:commentReference w:id="8"/>
+      <w:commentRangeEnd w:id="11"/>
+      <w:r>
+        <w:rPr>
+          <w:rStyle w:val="CommentReference"/>
+          <w:b/>
+        </w:rPr>
+        <w:commentReference w:id="11"/>
       </w:r>
       <w:r>
         <w:rPr>
@@ -895,19 +923,19 @@
         </w:rPr>
         <w:t xml:space="preserve">this is beyond the scope of this initial report.  We have added these </w:t>
       </w:r>
-      <w:commentRangeStart w:id="9"/>
+      <w:commentRangeStart w:id="12"/>
       <w:r>
         <w:rPr>
           <w:b/>
         </w:rPr>
         <w:t xml:space="preserve">limitations </w:t>
       </w:r>
-      <w:commentRangeEnd w:id="9"/>
-      <w:r>
-        <w:rPr>
-          <w:rStyle w:val="CommentReference"/>
-        </w:rPr>
-        <w:commentReference w:id="9"/>
+      <w:commentRangeEnd w:id="12"/>
+      <w:r>
+        <w:rPr>
+          <w:rStyle w:val="CommentReference"/>
+        </w:rPr>
+        <w:commentReference w:id="12"/>
       </w:r>
       <w:r>
         <w:rPr>
@@ -1039,7 +1067,7 @@
       </w:r>
     </w:p>
   </w:comment>
-  <w:comment w:id="4" w:author="Dave Bridges" w:date="2024-01-02T13:40:00Z" w:initials="DB">
+  <w:comment w:id="3" w:author="Dave Bridges" w:date="2024-01-05T12:23:00Z" w:initials="DB">
     <w:p>
       <w:pPr>
         <w:pStyle w:val="CommentText"/>
@@ -1051,11 +1079,51 @@
         <w:annotationRef/>
       </w:r>
       <w:r>
+        <w:t>Check if we are seeing more adipocytes</w:t>
+      </w:r>
+    </w:p>
+  </w:comment>
+  <w:comment w:id="4" w:author="Dave Bridges" w:date="2024-01-05T12:24:00Z" w:initials="DB">
+    <w:p>
+      <w:pPr>
+        <w:pStyle w:val="CommentText"/>
+      </w:pPr>
+      <w:r>
+        <w:rPr>
+          <w:rStyle w:val="CommentReference"/>
+        </w:rPr>
+        <w:annotationRef/>
+      </w:r>
+      <w:r>
+        <w:t xml:space="preserve">Now </w:t>
+      </w:r>
+      <w:proofErr w:type="spellStart"/>
+      <w:r>
+        <w:t>dedif</w:t>
+      </w:r>
+      <w:proofErr w:type="spellEnd"/>
+      <w:r>
+        <w:t xml:space="preserve"> preadipocytes are knocked out.</w:t>
+      </w:r>
+    </w:p>
+  </w:comment>
+  <w:comment w:id="5" w:author="Dave Bridges" w:date="2024-01-02T13:40:00Z" w:initials="DB">
+    <w:p>
+      <w:pPr>
+        <w:pStyle w:val="CommentText"/>
+      </w:pPr>
+      <w:r>
+        <w:rPr>
+          <w:rStyle w:val="CommentReference"/>
+        </w:rPr>
+        <w:annotationRef/>
+      </w:r>
+      <w:r>
         <w:t>insert new language about fatty acid profiling.</w:t>
       </w:r>
     </w:p>
   </w:comment>
-  <w:comment w:id="5" w:author="Dave Bridges" w:date="2024-01-02T13:38:00Z" w:initials="DB">
+  <w:comment w:id="6" w:author="Dave Bridges" w:date="2024-01-02T13:38:00Z" w:initials="DB">
     <w:p>
       <w:pPr>
         <w:pStyle w:val="CommentText"/>
@@ -1071,7 +1139,7 @@
       </w:r>
     </w:p>
   </w:comment>
-  <w:comment w:id="6" w:author="Dave Bridges" w:date="2024-01-02T13:43:00Z" w:initials="DB">
+  <w:comment w:id="7" w:author="Dave Bridges" w:date="2024-01-02T13:43:00Z" w:initials="DB">
     <w:p>
       <w:pPr>
         <w:pStyle w:val="CommentText"/>
@@ -1087,7 +1155,7 @@
       </w:r>
     </w:p>
   </w:comment>
-  <w:comment w:id="7" w:author="Dave Bridges" w:date="2024-01-02T13:45:00Z" w:initials="DB">
+  <w:comment w:id="8" w:author="Dave Bridges" w:date="2024-01-02T13:45:00Z" w:initials="DB">
     <w:p>
       <w:pPr>
         <w:pStyle w:val="CommentText"/>
@@ -1111,7 +1179,7 @@
       </w:r>
     </w:p>
   </w:comment>
-  <w:comment w:id="8" w:author="Dave Bridges" w:date="2024-01-02T13:46:00Z" w:initials="DB">
+  <w:comment w:id="9" w:author="Dave Bridges" w:date="2024-01-05T12:25:00Z" w:initials="DB">
     <w:p>
       <w:pPr>
         <w:pStyle w:val="CommentText"/>
@@ -1123,11 +1191,50 @@
         <w:annotationRef/>
       </w:r>
       <w:r>
+        <w:t xml:space="preserve">indirect signaling through </w:t>
+      </w:r>
+      <w:proofErr w:type="spellStart"/>
+      <w:r>
+        <w:t>resolvins</w:t>
+      </w:r>
+      <w:proofErr w:type="spellEnd"/>
+      <w:r>
+        <w:t>, future studies looking at levels of mediators in tissues.</w:t>
+      </w:r>
+    </w:p>
+    <w:p>
+      <w:pPr>
+        <w:pStyle w:val="CommentText"/>
+      </w:pPr>
+    </w:p>
+    <w:p>
+      <w:pPr>
+        <w:pStyle w:val="CommentText"/>
+      </w:pPr>
+      <w:r>
+        <w:t>Markers of anti-inflammatory cells in the mammary gland, maybe in B cells, inflammatory cells in involution.</w:t>
+      </w:r>
+      <w:bookmarkStart w:id="10" w:name="_GoBack"/>
+      <w:bookmarkEnd w:id="10"/>
+    </w:p>
+  </w:comment>
+  <w:comment w:id="11" w:author="Dave Bridges" w:date="2024-01-02T13:46:00Z" w:initials="DB">
+    <w:p>
+      <w:pPr>
+        <w:pStyle w:val="CommentText"/>
+      </w:pPr>
+      <w:r>
+        <w:rPr>
+          <w:rStyle w:val="CommentReference"/>
+        </w:rPr>
+        <w:annotationRef/>
+      </w:r>
+      <w:r>
         <w:t>check this</w:t>
       </w:r>
     </w:p>
   </w:comment>
-  <w:comment w:id="9" w:author="Dave Bridges" w:date="2024-01-02T13:51:00Z" w:initials="DB">
+  <w:comment w:id="12" w:author="Dave Bridges" w:date="2024-01-02T13:51:00Z" w:initials="DB">
     <w:p>
       <w:pPr>
         <w:pStyle w:val="CommentText"/>
@@ -1151,10 +1258,13 @@
   <w15:commentEx w15:paraId="7DB28A82" w15:done="0"/>
   <w15:commentEx w15:paraId="172B72B2" w15:done="0"/>
   <w15:commentEx w15:paraId="0F10F7CB" w15:done="0"/>
+  <w15:commentEx w15:paraId="5B8DBA46" w15:done="0"/>
+  <w15:commentEx w15:paraId="67D9A9AD" w15:paraIdParent="5B8DBA46" w15:done="0"/>
   <w15:commentEx w15:paraId="5447DE6D" w15:done="0"/>
   <w15:commentEx w15:paraId="5AD66158" w15:done="0"/>
   <w15:commentEx w15:paraId="42522672" w15:done="0"/>
   <w15:commentEx w15:paraId="4FB8AA9D" w15:done="0"/>
+  <w15:commentEx w15:paraId="505FD812" w15:paraIdParent="4FB8AA9D" w15:done="0"/>
   <w15:commentEx w15:paraId="2725F886" w15:done="0"/>
   <w15:commentEx w15:paraId="5541BD47" w15:done="0"/>
 </w15:commentsEx>
@@ -1165,10 +1275,13 @@
   <w16cid:commentId w16cid:paraId="7DB28A82" w16cid:durableId="293E901D"/>
   <w16cid:commentId w16cid:paraId="172B72B2" w16cid:durableId="293E9013"/>
   <w16cid:commentId w16cid:paraId="0F10F7CB" w16cid:durableId="293E900E"/>
+  <w16cid:commentId w16cid:paraId="5B8DBA46" w16cid:durableId="2942733C"/>
+  <w16cid:commentId w16cid:paraId="67D9A9AD" w16cid:durableId="29427365"/>
   <w16cid:commentId w16cid:paraId="5447DE6D" w16cid:durableId="293E90D2"/>
   <w16cid:commentId w16cid:paraId="5AD66158" w16cid:durableId="293E9059"/>
   <w16cid:commentId w16cid:paraId="42522672" w16cid:durableId="293E9173"/>
   <w16cid:commentId w16cid:paraId="4FB8AA9D" w16cid:durableId="293E9205"/>
+  <w16cid:commentId w16cid:paraId="505FD812" w16cid:durableId="294273BE"/>
   <w16cid:commentId w16cid:paraId="2725F886" w16cid:durableId="293E923D"/>
   <w16cid:commentId w16cid:paraId="5541BD47" w16cid:durableId="293E9348"/>
 </w16cid:commentsIds>

</xml_diff>